<commit_message>
style(report): format cover page to match outline specification with Sudheesh P on top
- Remove roster table and format student entries as centered blocks (Name, Roll No, University ID)
- Place Sudheesh P as MEMBER 1 on top of the list, followed by Babithosh EB, Minna Antony, and Sebin Xavier
- Update Certificate of Completion and Declaration signatures to prioritize Sudheesh P
- Recompile synchronized 39-page DOCX and PDF deliverables
</commit_message>
<xml_diff>
--- a/Starbase Material Selection System — Project Report.docx
+++ b/Starbase Material Selection System — Project Report.docx
@@ -4,7 +4,7 @@
   <w:body>
     <w:p>
       <w:pPr>
-        <w:spacing w:before="200" w:after="280"/>
+        <w:spacing w:before="0" w:after="240"/>
         <w:jc w:val="center"/>
       </w:pPr>
       <w:r>
@@ -44,35 +44,36 @@
     </w:p>
     <w:p>
       <w:pPr>
-        <w:spacing w:before="80" w:after="120" w:line="276" w:lineRule="auto"/>
+        <w:spacing w:before="0" w:after="200" w:line="276" w:lineRule="auto"/>
         <w:jc w:val="center"/>
       </w:pPr>
       <w:r>
         <w:rPr>
           <w:rFonts w:ascii="Times New Roman" w:hAnsi="Times New Roman"/>
           <w:b/>
-          <w:sz w:val="44"/>
+          <w:i/>
+          <w:sz w:val="48"/>
         </w:rPr>
         <w:t>STARBASE MATERIAL SELECTION SYSTEM</w:t>
       </w:r>
     </w:p>
     <w:p>
       <w:pPr>
-        <w:spacing w:before="0" w:after="320"/>
+        <w:spacing w:before="0" w:after="240"/>
         <w:jc w:val="center"/>
       </w:pPr>
       <w:r>
         <w:rPr>
           <w:rFonts w:ascii="Times New Roman" w:hAnsi="Times New Roman"/>
           <w:b/>
-          <w:sz w:val="30"/>
+          <w:sz w:val="32"/>
         </w:rPr>
         <w:t>PROJECT REPORT</w:t>
       </w:r>
     </w:p>
     <w:p>
       <w:pPr>
-        <w:spacing w:before="120" w:after="160"/>
+        <w:spacing w:before="0" w:after="200"/>
         <w:jc w:val="center"/>
       </w:pPr>
       <w:r>
@@ -84,367 +85,41 @@
         <w:t>Submitted by</w:t>
       </w:r>
     </w:p>
-    <w:tbl>
-      <w:tblPr>
-        <w:tblW w:type="auto" w:w="0"/>
+    <w:p>
+      <w:pPr>
+        <w:spacing w:before="0" w:after="160" w:line="276" w:lineRule="auto"/>
         <w:jc w:val="center"/>
-        <w:tblLook w:firstColumn="1" w:firstRow="1" w:lastColumn="0" w:lastRow="0" w:noHBand="0" w:noVBand="1" w:val="04A0"/>
-        <w:tblBorders>
-          <w:top w:val="single" w:sz="4" w:space="0" w:color="B0B8C1"/>
-          <w:left w:val="single" w:sz="4" w:space="0" w:color="B0B8C1"/>
-          <w:bottom w:val="single" w:sz="4" w:space="0" w:color="B0B8C1"/>
-          <w:right w:val="single" w:sz="4" w:space="0" w:color="B0B8C1"/>
-          <w:insideH w:val="single" w:sz="4" w:space="0" w:color="B0B8C1"/>
-          <w:insideV w:val="single" w:sz="4" w:space="0" w:color="B0B8C1"/>
-        </w:tblBorders>
-      </w:tblPr>
-      <w:tblGrid>
-        <w:gridCol w:w="2888"/>
-        <w:gridCol w:w="2888"/>
-        <w:gridCol w:w="2888"/>
-      </w:tblGrid>
-      <w:tr>
-        <w:trPr>
-          <w:cantSplit/>
-          <w:tblHeader/>
-        </w:trPr>
-        <w:tc>
-          <w:tcPr>
-            <w:tcW w:type="dxa" w:w="3744"/>
-            <w:shd w:val="clear" w:color="auto" w:fill="EAEFF5"/>
-            <w:vAlign w:val="center"/>
-          </w:tcPr>
-          <w:p>
-            <w:pPr>
-              <w:spacing w:line="252" w:lineRule="auto" w:before="40" w:after="40"/>
-              <w:jc w:val="left"/>
-            </w:pPr>
-            <w:r>
-              <w:rPr>
-                <w:rFonts w:ascii="Times New Roman" w:hAnsi="Times New Roman"/>
-                <w:b/>
-                <w:sz w:val="19"/>
-              </w:rPr>
-              <w:t>Student Name</w:t>
-            </w:r>
-          </w:p>
-        </w:tc>
-        <w:tc>
-          <w:tcPr>
-            <w:tcW w:type="dxa" w:w="2016"/>
-            <w:shd w:val="clear" w:color="auto" w:fill="EAEFF5"/>
-            <w:vAlign w:val="center"/>
-          </w:tcPr>
-          <w:p>
-            <w:pPr>
-              <w:spacing w:line="252" w:lineRule="auto" w:before="40" w:after="40"/>
-              <w:jc w:val="left"/>
-            </w:pPr>
-            <w:r>
-              <w:rPr>
-                <w:rFonts w:ascii="Times New Roman" w:hAnsi="Times New Roman"/>
-                <w:b/>
-                <w:sz w:val="19"/>
-              </w:rPr>
-              <w:t>Roll No.</w:t>
-            </w:r>
-          </w:p>
-        </w:tc>
-        <w:tc>
-          <w:tcPr>
-            <w:tcW w:type="dxa" w:w="2909"/>
-            <w:shd w:val="clear" w:color="auto" w:fill="EAEFF5"/>
-            <w:vAlign w:val="center"/>
-          </w:tcPr>
-          <w:p>
-            <w:pPr>
-              <w:spacing w:line="252" w:lineRule="auto" w:before="40" w:after="40"/>
-              <w:jc w:val="left"/>
-            </w:pPr>
-            <w:r>
-              <w:rPr>
-                <w:rFonts w:ascii="Times New Roman" w:hAnsi="Times New Roman"/>
-                <w:b/>
-                <w:sz w:val="19"/>
-              </w:rPr>
-              <w:t>University ID</w:t>
-            </w:r>
-          </w:p>
-        </w:tc>
-      </w:tr>
-      <w:tr>
-        <w:trPr>
-          <w:cantSplit/>
-        </w:trPr>
-        <w:tc>
-          <w:tcPr>
-            <w:tcW w:type="dxa" w:w="3744"/>
-            <w:shd w:val="clear" w:color="auto" w:fill="FAFBFC"/>
-            <w:vAlign w:val="center"/>
-          </w:tcPr>
-          <w:p>
-            <w:pPr>
-              <w:spacing w:line="252" w:lineRule="auto" w:before="20" w:after="20"/>
-              <w:jc w:val="left"/>
-            </w:pPr>
-            <w:r>
-              <w:rPr>
-                <w:rFonts w:ascii="Times New Roman" w:hAnsi="Times New Roman"/>
-                <w:sz w:val="18"/>
-              </w:rPr>
-              <w:t>Babithosh EB</w:t>
-            </w:r>
-          </w:p>
-        </w:tc>
-        <w:tc>
-          <w:tcPr>
-            <w:tcW w:type="dxa" w:w="2016"/>
-            <w:shd w:val="clear" w:color="auto" w:fill="FAFBFC"/>
-            <w:vAlign w:val="center"/>
-          </w:tcPr>
-          <w:p>
-            <w:pPr>
-              <w:spacing w:line="252" w:lineRule="auto" w:before="20" w:after="20"/>
-              <w:jc w:val="left"/>
-            </w:pPr>
-            <w:r>
-              <w:rPr>
-                <w:rFonts w:ascii="Times New Roman" w:hAnsi="Times New Roman"/>
-                <w:sz w:val="18"/>
-              </w:rPr>
-              <w:t>18</w:t>
-            </w:r>
-          </w:p>
-        </w:tc>
-        <w:tc>
-          <w:tcPr>
-            <w:tcW w:type="dxa" w:w="2909"/>
-            <w:shd w:val="clear" w:color="auto" w:fill="FAFBFC"/>
-            <w:vAlign w:val="center"/>
-          </w:tcPr>
-          <w:p>
-            <w:pPr>
-              <w:spacing w:line="252" w:lineRule="auto" w:before="20" w:after="20"/>
-              <w:jc w:val="left"/>
-            </w:pPr>
-            <w:r>
-              <w:rPr>
-                <w:rFonts w:ascii="Times New Roman" w:hAnsi="Times New Roman"/>
-                <w:sz w:val="18"/>
-              </w:rPr>
-              <w:t>LTVE24EL069</w:t>
-            </w:r>
-          </w:p>
-        </w:tc>
-      </w:tr>
-      <w:tr>
-        <w:trPr>
-          <w:cantSplit/>
-        </w:trPr>
-        <w:tc>
-          <w:tcPr>
-            <w:tcW w:type="dxa" w:w="3744"/>
-            <w:vAlign w:val="center"/>
-          </w:tcPr>
-          <w:p>
-            <w:pPr>
-              <w:spacing w:line="252" w:lineRule="auto" w:before="20" w:after="20"/>
-              <w:jc w:val="left"/>
-            </w:pPr>
-            <w:r>
-              <w:rPr>
-                <w:rFonts w:ascii="Times New Roman" w:hAnsi="Times New Roman"/>
-                <w:sz w:val="18"/>
-              </w:rPr>
-              <w:t>Minna Antony</w:t>
-            </w:r>
-          </w:p>
-        </w:tc>
-        <w:tc>
-          <w:tcPr>
-            <w:tcW w:type="dxa" w:w="2016"/>
-            <w:vAlign w:val="center"/>
-          </w:tcPr>
-          <w:p>
-            <w:pPr>
-              <w:spacing w:line="252" w:lineRule="auto" w:before="20" w:after="20"/>
-              <w:jc w:val="left"/>
-            </w:pPr>
-            <w:r>
-              <w:rPr>
-                <w:rFonts w:ascii="Times New Roman" w:hAnsi="Times New Roman"/>
-                <w:sz w:val="18"/>
-              </w:rPr>
-              <w:t>47</w:t>
-            </w:r>
-          </w:p>
-        </w:tc>
-        <w:tc>
-          <w:tcPr>
-            <w:tcW w:type="dxa" w:w="2909"/>
-            <w:vAlign w:val="center"/>
-          </w:tcPr>
-          <w:p>
-            <w:pPr>
-              <w:spacing w:line="252" w:lineRule="auto" w:before="20" w:after="20"/>
-              <w:jc w:val="left"/>
-            </w:pPr>
-            <w:r>
-              <w:rPr>
-                <w:rFonts w:ascii="Times New Roman" w:hAnsi="Times New Roman"/>
-                <w:sz w:val="18"/>
-              </w:rPr>
-              <w:t>TVE24EL044</w:t>
-            </w:r>
-          </w:p>
-        </w:tc>
-      </w:tr>
-      <w:tr>
-        <w:trPr>
-          <w:cantSplit/>
-        </w:trPr>
-        <w:tc>
-          <w:tcPr>
-            <w:tcW w:type="dxa" w:w="3744"/>
-            <w:shd w:val="clear" w:color="auto" w:fill="FAFBFC"/>
-            <w:vAlign w:val="center"/>
-          </w:tcPr>
-          <w:p>
-            <w:pPr>
-              <w:spacing w:line="252" w:lineRule="auto" w:before="20" w:after="20"/>
-              <w:jc w:val="left"/>
-            </w:pPr>
-            <w:r>
-              <w:rPr>
-                <w:rFonts w:ascii="Times New Roman" w:hAnsi="Times New Roman"/>
-                <w:sz w:val="18"/>
-              </w:rPr>
-              <w:t>Sebin Xavier</w:t>
-            </w:r>
-          </w:p>
-        </w:tc>
-        <w:tc>
-          <w:tcPr>
-            <w:tcW w:type="dxa" w:w="2016"/>
-            <w:shd w:val="clear" w:color="auto" w:fill="FAFBFC"/>
-            <w:vAlign w:val="center"/>
-          </w:tcPr>
-          <w:p>
-            <w:pPr>
-              <w:spacing w:line="252" w:lineRule="auto" w:before="20" w:after="20"/>
-              <w:jc w:val="left"/>
-            </w:pPr>
-            <w:r>
-              <w:rPr>
-                <w:rFonts w:ascii="Times New Roman" w:hAnsi="Times New Roman"/>
-                <w:sz w:val="18"/>
-              </w:rPr>
-              <w:t>60</w:t>
-            </w:r>
-          </w:p>
-        </w:tc>
-        <w:tc>
-          <w:tcPr>
-            <w:tcW w:type="dxa" w:w="2909"/>
-            <w:shd w:val="clear" w:color="auto" w:fill="FAFBFC"/>
-            <w:vAlign w:val="center"/>
-          </w:tcPr>
-          <w:p>
-            <w:pPr>
-              <w:spacing w:line="252" w:lineRule="auto" w:before="20" w:after="20"/>
-              <w:jc w:val="left"/>
-            </w:pPr>
-            <w:r>
-              <w:rPr>
-                <w:rFonts w:ascii="Times New Roman" w:hAnsi="Times New Roman"/>
-                <w:sz w:val="18"/>
-              </w:rPr>
-              <w:t>TVE24EL056</w:t>
-            </w:r>
-          </w:p>
-        </w:tc>
-      </w:tr>
-      <w:tr>
-        <w:trPr>
-          <w:cantSplit/>
-        </w:trPr>
-        <w:tc>
-          <w:tcPr>
-            <w:tcW w:type="dxa" w:w="3744"/>
-            <w:vAlign w:val="center"/>
-          </w:tcPr>
-          <w:p>
-            <w:pPr>
-              <w:spacing w:line="252" w:lineRule="auto" w:before="20" w:after="20"/>
-              <w:jc w:val="left"/>
-            </w:pPr>
-            <w:r>
-              <w:rPr>
-                <w:rFonts w:ascii="Times New Roman" w:hAnsi="Times New Roman"/>
-                <w:sz w:val="18"/>
-              </w:rPr>
-              <w:t>Sudheesh P</w:t>
-            </w:r>
-          </w:p>
-        </w:tc>
-        <w:tc>
-          <w:tcPr>
-            <w:tcW w:type="dxa" w:w="2016"/>
-            <w:vAlign w:val="center"/>
-          </w:tcPr>
-          <w:p>
-            <w:pPr>
-              <w:spacing w:line="252" w:lineRule="auto" w:before="20" w:after="20"/>
-              <w:jc w:val="left"/>
-            </w:pPr>
-            <w:r>
-              <w:rPr>
-                <w:rFonts w:ascii="Times New Roman" w:hAnsi="Times New Roman"/>
-                <w:sz w:val="18"/>
-              </w:rPr>
-              <w:t>64</w:t>
-            </w:r>
-          </w:p>
-        </w:tc>
-        <w:tc>
-          <w:tcPr>
-            <w:tcW w:type="dxa" w:w="2909"/>
-            <w:vAlign w:val="center"/>
-          </w:tcPr>
-          <w:p>
-            <w:pPr>
-              <w:spacing w:line="252" w:lineRule="auto" w:before="20" w:after="20"/>
-              <w:jc w:val="left"/>
-            </w:pPr>
-            <w:r>
-              <w:rPr>
-                <w:rFonts w:ascii="Times New Roman" w:hAnsi="Times New Roman"/>
-                <w:sz w:val="18"/>
-              </w:rPr>
-              <w:t>LTVE24EL071</w:t>
-            </w:r>
-          </w:p>
-        </w:tc>
-      </w:tr>
-    </w:tbl>
-    <w:p>
-      <w:pPr>
-        <w:spacing w:before="360" w:after="80" w:line="276" w:lineRule="auto"/>
-        <w:jc w:val="center"/>
-      </w:pPr>
-      <w:r>
-        <w:rPr>
-          <w:rFonts w:ascii="Times New Roman" w:hAnsi="Times New Roman"/>
-          <w:sz w:val="22"/>
-        </w:rPr>
-        <w:t>Submitted as part of the Project-Based Learning requirement for</w:t>
+      </w:pPr>
+      <w:r>
+        <w:rPr>
+          <w:rFonts w:ascii="Times New Roman" w:hAnsi="Times New Roman"/>
+          <w:b/>
+          <w:sz w:val="24"/>
+        </w:rPr>
+        <w:t>SUDHEESH P</w:t>
         <w:br/>
-        <w:t>Database Management System (PBEOT504)</w:t>
+      </w:r>
+      <w:r>
+        <w:rPr>
+          <w:rFonts w:ascii="Times New Roman" w:hAnsi="Times New Roman"/>
+          <w:b/>
+          <w:sz w:val="24"/>
+        </w:rPr>
+        <w:t>Roll No: 64</w:t>
+        <w:br/>
+      </w:r>
+      <w:r>
+        <w:rPr>
+          <w:rFonts w:ascii="Times New Roman" w:hAnsi="Times New Roman"/>
+          <w:b/>
+          <w:sz w:val="24"/>
+        </w:rPr>
+        <w:t>University ID: LTVE24EL071</w:t>
       </w:r>
     </w:p>
     <w:p>
       <w:pPr>
-        <w:spacing w:before="120" w:after="40"/>
+        <w:spacing w:before="0" w:after="160" w:line="276" w:lineRule="auto"/>
         <w:jc w:val="center"/>
       </w:pPr>
       <w:r>
@@ -453,27 +128,126 @@
           <w:b/>
           <w:sz w:val="24"/>
         </w:rPr>
-        <w:t>B.Tech Electrical and Computer Engineering</w:t>
+        <w:t>BABITHOSH EB</w:t>
+        <w:br/>
+      </w:r>
+      <w:r>
+        <w:rPr>
+          <w:rFonts w:ascii="Times New Roman" w:hAnsi="Times New Roman"/>
+          <w:b/>
+          <w:sz w:val="24"/>
+        </w:rPr>
+        <w:t>Roll No: 18</w:t>
+        <w:br/>
+      </w:r>
+      <w:r>
+        <w:rPr>
+          <w:rFonts w:ascii="Times New Roman" w:hAnsi="Times New Roman"/>
+          <w:b/>
+          <w:sz w:val="24"/>
+        </w:rPr>
+        <w:t>University ID: LTVE24EL069</w:t>
       </w:r>
     </w:p>
     <w:p>
       <w:pPr>
-        <w:spacing w:before="40" w:after="40"/>
+        <w:spacing w:before="0" w:after="160" w:line="276" w:lineRule="auto"/>
         <w:jc w:val="center"/>
       </w:pPr>
       <w:r>
         <w:rPr>
           <w:rFonts w:ascii="Times New Roman" w:hAnsi="Times New Roman"/>
+          <w:b/>
+          <w:sz w:val="24"/>
+        </w:rPr>
+        <w:t>MINNA ANTONY</w:t>
+        <w:br/>
+      </w:r>
+      <w:r>
+        <w:rPr>
+          <w:rFonts w:ascii="Times New Roman" w:hAnsi="Times New Roman"/>
+          <w:b/>
+          <w:sz w:val="24"/>
+        </w:rPr>
+        <w:t>Roll No: 47</w:t>
+        <w:br/>
+      </w:r>
+      <w:r>
+        <w:rPr>
+          <w:rFonts w:ascii="Times New Roman" w:hAnsi="Times New Roman"/>
+          <w:b/>
+          <w:sz w:val="24"/>
+        </w:rPr>
+        <w:t>University ID: TVE24EL044</w:t>
+      </w:r>
+    </w:p>
+    <w:p>
+      <w:pPr>
+        <w:spacing w:before="0" w:after="160" w:line="276" w:lineRule="auto"/>
+        <w:jc w:val="center"/>
+      </w:pPr>
+      <w:r>
+        <w:rPr>
+          <w:rFonts w:ascii="Times New Roman" w:hAnsi="Times New Roman"/>
+          <w:b/>
+          <w:sz w:val="24"/>
+        </w:rPr>
+        <w:t>SEBIN XAVIER</w:t>
+        <w:br/>
+      </w:r>
+      <w:r>
+        <w:rPr>
+          <w:rFonts w:ascii="Times New Roman" w:hAnsi="Times New Roman"/>
+          <w:b/>
+          <w:sz w:val="24"/>
+        </w:rPr>
+        <w:t>Roll No: 60</w:t>
+        <w:br/>
+      </w:r>
+      <w:r>
+        <w:rPr>
+          <w:rFonts w:ascii="Times New Roman" w:hAnsi="Times New Roman"/>
+          <w:b/>
+          <w:sz w:val="24"/>
+        </w:rPr>
+        <w:t>University ID: TVE24EL056</w:t>
+      </w:r>
+    </w:p>
+    <w:p>
+      <w:pPr>
+        <w:spacing w:before="200" w:after="240" w:line="276" w:lineRule="auto"/>
+        <w:jc w:val="center"/>
+      </w:pPr>
+      <w:r>
+        <w:rPr>
+          <w:rFonts w:ascii="Times New Roman" w:hAnsi="Times New Roman"/>
+          <w:b/>
+          <w:sz w:val="24"/>
+        </w:rPr>
+        <w:t>B.Tech Electrical and Computer Engineering</w:t>
+        <w:br/>
+      </w:r>
+      <w:r>
+        <w:rPr>
+          <w:rFonts w:ascii="Times New Roman" w:hAnsi="Times New Roman"/>
+          <w:b/>
           <w:sz w:val="24"/>
         </w:rPr>
         <w:t>Department of Electrical Engineering</w:t>
         <w:br/>
+      </w:r>
+      <w:r>
+        <w:rPr>
+          <w:rFonts w:ascii="Times New Roman" w:hAnsi="Times New Roman"/>
+          <w:b/>
+          <w:sz w:val="24"/>
+        </w:rPr>
         <w:t>College of Engineering Trivandrum</w:t>
       </w:r>
     </w:p>
     <w:p>
       <w:pPr>
-        <w:spacing w:before="120" w:after="0"/>
+        <w:spacing w:before="0" w:after="0"/>
         <w:jc w:val="center"/>
       </w:pPr>
       <w:r>
@@ -521,7 +295,7 @@
           <w:i w:val="0"/>
           <w:sz w:val="24"/>
         </w:rPr>
-        <w:t>This is to certify that Babithosh EB (Roll No. 18), Minna Antony (Roll No. 47), Sebin Xavier (Roll No. 60), and Sudheesh P (Roll No. 64), B.Tech Electrical and Computer Engineering students of College of Engineering Trivandrum, have completed the work presented in the report titled “Starbase Material Selection System” at College of Engineering Trivandrum, as part of the Database Management System (PBEOT504) Project-Based Learning (PBL) curriculum. This is a bonafide record of their original work carried out under our supervision and guidance.</w:t>
+        <w:t>This is to certify that Sudheesh P (Roll No. 64), Babithosh EB (Roll No. 18), Minna Antony (Roll No. 47), and Sebin Xavier (Roll No. 60), B.Tech Electrical and Computer Engineering students of College of Engineering Trivandrum, have completed the work presented in the report titled “Starbase Material Selection System” at College of Engineering Trivandrum, as part of the Database Management System (PBEOT504) Project-Based Learning (PBL) curriculum. This is a bonafide record of their original work carried out under our supervision and guidance.</w:t>
       </w:r>
     </w:p>
     <w:p>
@@ -658,6 +432,14 @@
           <w:rFonts w:ascii="Times New Roman" w:hAnsi="Times New Roman"/>
           <w:sz w:val="21"/>
         </w:rPr>
+        <w:t>Sudheesh P   (Roll No. 64, TVE ID: LTVE24EL071)     Signature: ___________________</w:t>
+        <w:br/>
+      </w:r>
+      <w:r>
+        <w:rPr>
+          <w:rFonts w:ascii="Times New Roman" w:hAnsi="Times New Roman"/>
+          <w:sz w:val="21"/>
+        </w:rPr>
         <w:t>Babithosh EB (Roll No. 18, TVE ID: LTVE24EL069)     Signature: ___________________</w:t>
         <w:br/>
       </w:r>
@@ -675,14 +457,6 @@
           <w:sz w:val="21"/>
         </w:rPr>
         <w:t>Sebin Xavier (Roll No. 60, TVE ID: TVE24EL056)     Signature: ___________________</w:t>
-        <w:br/>
-      </w:r>
-      <w:r>
-        <w:rPr>
-          <w:rFonts w:ascii="Times New Roman" w:hAnsi="Times New Roman"/>
-          <w:sz w:val="21"/>
-        </w:rPr>
-        <w:t>Sudheesh P   (Roll No. 64, TVE ID: LTVE24EL071)     Signature: ___________________</w:t>
         <w:br/>
       </w:r>
     </w:p>

</xml_diff>

<commit_message>
docs: integrate enhanced diagrams and update report deliverables
- Add Fig 2.2 multi-criteria screening & ranking algorithm flowchart
- Enhance Fig 3.1 conceptual & logical ER diagram with associative entities
- Add Fig 3.2 physical relational schema dependency & foreign key map
- Add Fig 4.1 transactional batch ETL ingestion pipeline architecture
- Render high-resolution PNGs and recompile 40-page academic DOCX and PDF with synchronized LOF/TOC
</commit_message>
<xml_diff>
--- a/Starbase Material Selection System — Project Report.docx
+++ b/Starbase Material Selection System — Project Report.docx
@@ -1008,7 +1008,7 @@
           <w:b w:val="0"/>
           <w:sz w:val="22"/>
         </w:rPr>
-        <w:t>7</w:t>
+        <w:t>8</w:t>
       </w:r>
     </w:p>
     <w:p>
@@ -1036,7 +1036,7 @@
           <w:b/>
           <w:sz w:val="22"/>
         </w:rPr>
-        <w:t>10</w:t>
+        <w:t>11</w:t>
       </w:r>
     </w:p>
     <w:p>
@@ -1064,7 +1064,7 @@
           <w:b w:val="0"/>
           <w:sz w:val="22"/>
         </w:rPr>
-        <w:t>10</w:t>
+        <w:t>11</w:t>
       </w:r>
     </w:p>
     <w:p>
@@ -1092,7 +1092,7 @@
           <w:b w:val="0"/>
           <w:sz w:val="22"/>
         </w:rPr>
-        <w:t>10</w:t>
+        <w:t>11</w:t>
       </w:r>
     </w:p>
     <w:p>
@@ -1120,7 +1120,7 @@
           <w:b w:val="0"/>
           <w:sz w:val="22"/>
         </w:rPr>
-        <w:t>11</w:t>
+        <w:t>12</w:t>
       </w:r>
     </w:p>
     <w:p>
@@ -1148,7 +1148,7 @@
           <w:b w:val="0"/>
           <w:sz w:val="22"/>
         </w:rPr>
-        <w:t>12</w:t>
+        <w:t>13</w:t>
       </w:r>
     </w:p>
     <w:p>
@@ -1176,7 +1176,7 @@
           <w:b w:val="0"/>
           <w:sz w:val="22"/>
         </w:rPr>
-        <w:t>14</w:t>
+        <w:t>16</w:t>
       </w:r>
     </w:p>
     <w:p>
@@ -1204,7 +1204,7 @@
           <w:b w:val="0"/>
           <w:sz w:val="22"/>
         </w:rPr>
-        <w:t>16</w:t>
+        <w:t>18</w:t>
       </w:r>
     </w:p>
     <w:p>
@@ -1232,7 +1232,7 @@
           <w:b/>
           <w:sz w:val="22"/>
         </w:rPr>
-        <w:t>18</w:t>
+        <w:t>19</w:t>
       </w:r>
     </w:p>
     <w:p>
@@ -1260,7 +1260,7 @@
           <w:b w:val="0"/>
           <w:sz w:val="22"/>
         </w:rPr>
-        <w:t>18</w:t>
+        <w:t>19</w:t>
       </w:r>
     </w:p>
     <w:p>
@@ -1288,7 +1288,7 @@
           <w:b w:val="0"/>
           <w:sz w:val="22"/>
         </w:rPr>
-        <w:t>18</w:t>
+        <w:t>19</w:t>
       </w:r>
     </w:p>
     <w:p>
@@ -1316,7 +1316,7 @@
           <w:b w:val="0"/>
           <w:sz w:val="22"/>
         </w:rPr>
-        <w:t>19</w:t>
+        <w:t>20</w:t>
       </w:r>
     </w:p>
     <w:p>
@@ -1344,7 +1344,7 @@
           <w:b w:val="0"/>
           <w:sz w:val="22"/>
         </w:rPr>
-        <w:t>20</w:t>
+        <w:t>21</w:t>
       </w:r>
     </w:p>
     <w:p>
@@ -1372,7 +1372,7 @@
           <w:b w:val="0"/>
           <w:sz w:val="22"/>
         </w:rPr>
-        <w:t>21</w:t>
+        <w:t>22</w:t>
       </w:r>
     </w:p>
     <w:p>
@@ -1400,7 +1400,7 @@
           <w:b w:val="0"/>
           <w:sz w:val="22"/>
         </w:rPr>
-        <w:t>21</w:t>
+        <w:t>23</w:t>
       </w:r>
     </w:p>
     <w:p>
@@ -1428,7 +1428,7 @@
           <w:b w:val="0"/>
           <w:sz w:val="22"/>
         </w:rPr>
-        <w:t>21</w:t>
+        <w:t>23</w:t>
       </w:r>
     </w:p>
     <w:p>
@@ -1456,7 +1456,7 @@
           <w:b/>
           <w:sz w:val="22"/>
         </w:rPr>
-        <w:t>23</w:t>
+        <w:t>24</w:t>
       </w:r>
     </w:p>
     <w:p>
@@ -1484,7 +1484,7 @@
           <w:b w:val="0"/>
           <w:sz w:val="22"/>
         </w:rPr>
-        <w:t>23</w:t>
+        <w:t>24</w:t>
       </w:r>
     </w:p>
     <w:p>
@@ -1512,7 +1512,7 @@
           <w:b w:val="0"/>
           <w:sz w:val="22"/>
         </w:rPr>
-        <w:t>23</w:t>
+        <w:t>24</w:t>
       </w:r>
     </w:p>
     <w:p>
@@ -1540,7 +1540,7 @@
           <w:b w:val="0"/>
           <w:sz w:val="22"/>
         </w:rPr>
-        <w:t>23</w:t>
+        <w:t>24</w:t>
       </w:r>
     </w:p>
     <w:p>
@@ -1568,7 +1568,7 @@
           <w:b w:val="0"/>
           <w:sz w:val="22"/>
         </w:rPr>
-        <w:t>26</w:t>
+        <w:t>27</w:t>
       </w:r>
     </w:p>
     <w:p>
@@ -1596,7 +1596,7 @@
           <w:b/>
           <w:sz w:val="22"/>
         </w:rPr>
-        <w:t>28</w:t>
+        <w:t>29</w:t>
       </w:r>
     </w:p>
     <w:p>
@@ -1624,7 +1624,7 @@
           <w:b w:val="0"/>
           <w:sz w:val="22"/>
         </w:rPr>
-        <w:t>28</w:t>
+        <w:t>29</w:t>
       </w:r>
     </w:p>
     <w:p>
@@ -1652,7 +1652,7 @@
           <w:b w:val="0"/>
           <w:sz w:val="22"/>
         </w:rPr>
-        <w:t>28</w:t>
+        <w:t>29</w:t>
       </w:r>
     </w:p>
     <w:p>
@@ -1680,7 +1680,7 @@
           <w:b w:val="0"/>
           <w:sz w:val="22"/>
         </w:rPr>
-        <w:t>28</w:t>
+        <w:t>29</w:t>
       </w:r>
     </w:p>
     <w:p>
@@ -1708,7 +1708,7 @@
           <w:b/>
           <w:sz w:val="22"/>
         </w:rPr>
-        <w:t>30</w:t>
+        <w:t>31</w:t>
       </w:r>
     </w:p>
     <w:p>
@@ -1768,7 +1768,7 @@
           <w:b w:val="0"/>
           <w:sz w:val="22"/>
         </w:rPr>
-        <w:t>Figure 2.2 — Level 0 Data Flow Diagram (Context Analysis)</w:t>
+        <w:t>Figure 2.2 — Multi-criteria screening and weighted priority ranking algorithm flowchart</w:t>
       </w:r>
       <w:r>
         <w:tab/>
@@ -1796,7 +1796,7 @@
           <w:b w:val="0"/>
           <w:sz w:val="22"/>
         </w:rPr>
-        <w:t>Figure 2.3 — Level 1 Data Flow Diagram (Decomposed Functional Modules)</w:t>
+        <w:t>Figure 2.3 — Level 0 Data Flow Diagram (Context Analysis)</w:t>
       </w:r>
       <w:r>
         <w:tab/>
@@ -1824,7 +1824,7 @@
           <w:b w:val="0"/>
           <w:sz w:val="22"/>
         </w:rPr>
-        <w:t>Figure 3.1 — Entity–Relationship (ER) diagram for Starbase material catalog</w:t>
+        <w:t>Figure 2.4 — Level 1 Data Flow Diagram (Decomposed Functional Modules)</w:t>
       </w:r>
       <w:r>
         <w:tab/>
@@ -1835,7 +1835,7 @@
           <w:b w:val="0"/>
           <w:sz w:val="22"/>
         </w:rPr>
-        <w:t>11</w:t>
+        <w:t>10</w:t>
       </w:r>
     </w:p>
     <w:p>
@@ -1852,7 +1852,7 @@
           <w:b w:val="0"/>
           <w:sz w:val="22"/>
         </w:rPr>
-        <w:t>Figure 5.1 — Starbase Desktop Landing and Overview Interface</w:t>
+        <w:t>Figure 3.1 — Conceptual and logical Entity–Relationship (ER) diagram for Starbase material catalog and workspace</w:t>
       </w:r>
       <w:r>
         <w:tab/>
@@ -1863,7 +1863,7 @@
           <w:b w:val="0"/>
           <w:sz w:val="22"/>
         </w:rPr>
-        <w:t>24</w:t>
+        <w:t>12</w:t>
       </w:r>
     </w:p>
     <w:p>
@@ -1880,7 +1880,7 @@
           <w:b w:val="0"/>
           <w:sz w:val="22"/>
         </w:rPr>
-        <w:t>Figure 5.2 — Responsive Mobile Material Exploration Interface</w:t>
+        <w:t>Figure 3.2 — Relational schema dependency and foreign key map across the core database tables</w:t>
       </w:r>
       <w:r>
         <w:tab/>
@@ -1891,7 +1891,7 @@
           <w:b w:val="0"/>
           <w:sz w:val="22"/>
         </w:rPr>
-        <w:t>25</w:t>
+        <w:t>14</w:t>
       </w:r>
     </w:p>
     <w:p>
@@ -1908,7 +1908,7 @@
           <w:b w:val="0"/>
           <w:sz w:val="22"/>
         </w:rPr>
-        <w:t>Figure 5.3 — Material Library with Property-Value Sorting and Provenance Tracking</w:t>
+        <w:t>Figure 4.1 — Transactional batch ETL pipeline and ingestion architecture across 14 material repositories</w:t>
       </w:r>
       <w:r>
         <w:tab/>
@@ -1919,7 +1919,7 @@
           <w:b w:val="0"/>
           <w:sz w:val="22"/>
         </w:rPr>
-        <w:t>26</w:t>
+        <w:t>21</w:t>
       </w:r>
     </w:p>
     <w:p>
@@ -1936,7 +1936,7 @@
           <w:b w:val="0"/>
           <w:sz w:val="22"/>
         </w:rPr>
-        <w:t>Figure 5.4 — Multi-Attribute Selection Studio with Ranked Recommendations</w:t>
+        <w:t>Figure 5.1 — Starbase Desktop Landing and Overview Interface</w:t>
       </w:r>
       <w:r>
         <w:tab/>
@@ -1947,22 +1947,7 @@
           <w:b w:val="0"/>
           <w:sz w:val="22"/>
         </w:rPr>
-        <w:t>26</w:t>
-      </w:r>
-    </w:p>
-    <w:p>
-      <w:pPr>
-        <w:pageBreakBefore/>
-        <w:spacing w:before="240" w:after="320"/>
-        <w:jc w:val="center"/>
-      </w:pPr>
-      <w:r>
-        <w:rPr>
-          <w:rFonts w:ascii="Times New Roman" w:hAnsi="Times New Roman"/>
-          <w:b/>
-          <w:sz w:val="32"/>
-        </w:rPr>
-        <w:t>LIST OF TABLES</w:t>
+        <w:t>25</w:t>
       </w:r>
     </w:p>
     <w:p>
@@ -1979,7 +1964,7 @@
           <w:b w:val="0"/>
           <w:sz w:val="22"/>
         </w:rPr>
-        <w:t>Table 2.1 — System Requirements Specifications</w:t>
+        <w:t>Figure 5.2 — Responsive Mobile Material Exploration Interface</w:t>
       </w:r>
       <w:r>
         <w:tab/>
@@ -1990,7 +1975,7 @@
           <w:b w:val="0"/>
           <w:sz w:val="22"/>
         </w:rPr>
-        <w:t>5</w:t>
+        <w:t>26</w:t>
       </w:r>
     </w:p>
     <w:p>
@@ -2007,7 +1992,7 @@
           <w:b w:val="0"/>
           <w:sz w:val="22"/>
         </w:rPr>
-        <w:t>Table 2.2 — DFD Process Specifications and Data Store Interactions</w:t>
+        <w:t>Figure 5.3 — Material Library with Property-Value Sorting and Provenance Tracking</w:t>
       </w:r>
       <w:r>
         <w:tab/>
@@ -2018,7 +2003,7 @@
           <w:b w:val="0"/>
           <w:sz w:val="22"/>
         </w:rPr>
-        <w:t>7</w:t>
+        <w:t>27</w:t>
       </w:r>
     </w:p>
     <w:p>
@@ -2035,7 +2020,7 @@
           <w:b w:val="0"/>
           <w:sz w:val="22"/>
         </w:rPr>
-        <w:t>Table 3.1 — Database Schema Architecture and Entity Groupings</w:t>
+        <w:t>Figure 5.4 — Multi-Attribute Selection Studio with Ranked Candidate Recommendations</w:t>
       </w:r>
       <w:r>
         <w:tab/>
@@ -2046,7 +2031,22 @@
           <w:b w:val="0"/>
           <w:sz w:val="22"/>
         </w:rPr>
-        <w:t>10</w:t>
+        <w:t>27</w:t>
+      </w:r>
+    </w:p>
+    <w:p>
+      <w:pPr>
+        <w:pageBreakBefore/>
+        <w:spacing w:before="240" w:after="320"/>
+        <w:jc w:val="center"/>
+      </w:pPr>
+      <w:r>
+        <w:rPr>
+          <w:rFonts w:ascii="Times New Roman" w:hAnsi="Times New Roman"/>
+          <w:b/>
+          <w:sz w:val="32"/>
+        </w:rPr>
+        <w:t>LIST OF TABLES</w:t>
       </w:r>
     </w:p>
     <w:p>
@@ -2063,7 +2063,7 @@
           <w:b w:val="0"/>
           <w:sz w:val="22"/>
         </w:rPr>
-        <w:t>Table 3.2 — Three-Schema Architecture Implementation in Starbase</w:t>
+        <w:t>Table 2.1 — System Requirements Specifications</w:t>
       </w:r>
       <w:r>
         <w:tab/>
@@ -2074,7 +2074,7 @@
           <w:b w:val="0"/>
           <w:sz w:val="22"/>
         </w:rPr>
-        <w:t>10</w:t>
+        <w:t>5</w:t>
       </w:r>
     </w:p>
     <w:p>
@@ -2091,7 +2091,7 @@
           <w:b w:val="0"/>
           <w:sz w:val="22"/>
         </w:rPr>
-        <w:t>Table 3.3 — Entity Cardinality and Relationship Constraints</w:t>
+        <w:t>Table 2.2 — DFD Process Specifications and Data Store Interactions</w:t>
       </w:r>
       <w:r>
         <w:tab/>
@@ -2102,7 +2102,7 @@
           <w:b w:val="0"/>
           <w:sz w:val="22"/>
         </w:rPr>
-        <w:t>12</w:t>
+        <w:t>8</w:t>
       </w:r>
     </w:p>
     <w:p>
@@ -2119,7 +2119,7 @@
           <w:b w:val="0"/>
           <w:sz w:val="22"/>
         </w:rPr>
-        <w:t>Table 3.4 — Data Dictionary for Data_Source Entity</w:t>
+        <w:t>Table 3.1 — Database Schema Architecture and Entity Groupings</w:t>
       </w:r>
       <w:r>
         <w:tab/>
@@ -2130,7 +2130,7 @@
           <w:b w:val="0"/>
           <w:sz w:val="22"/>
         </w:rPr>
-        <w:t>15</w:t>
+        <w:t>11</w:t>
       </w:r>
     </w:p>
     <w:p>
@@ -2147,7 +2147,7 @@
           <w:b w:val="0"/>
           <w:sz w:val="22"/>
         </w:rPr>
-        <w:t>Table 3.5 — Data Dictionary for Material Entity</w:t>
+        <w:t>Table 3.2 — Three-Schema Architecture Implementation in Starbase</w:t>
       </w:r>
       <w:r>
         <w:tab/>
@@ -2158,7 +2158,7 @@
           <w:b w:val="0"/>
           <w:sz w:val="22"/>
         </w:rPr>
-        <w:t>15</w:t>
+        <w:t>11</w:t>
       </w:r>
     </w:p>
     <w:p>
@@ -2175,7 +2175,7 @@
           <w:b w:val="0"/>
           <w:sz w:val="22"/>
         </w:rPr>
-        <w:t>Table 3.6 — Data Dictionary for Property Entity</w:t>
+        <w:t>Table 3.3 — Entity Cardinality and Relationship Constraints</w:t>
       </w:r>
       <w:r>
         <w:tab/>
@@ -2186,7 +2186,7 @@
           <w:b w:val="0"/>
           <w:sz w:val="22"/>
         </w:rPr>
-        <w:t>15</w:t>
+        <w:t>13</w:t>
       </w:r>
     </w:p>
     <w:p>
@@ -2203,7 +2203,7 @@
           <w:b w:val="0"/>
           <w:sz w:val="22"/>
         </w:rPr>
-        <w:t>Table 3.7 — Data Dictionary for Material_Property Association Table</w:t>
+        <w:t>Table 3.4 — Data Dictionary for Data_Source Entity</w:t>
       </w:r>
       <w:r>
         <w:tab/>
@@ -2231,7 +2231,7 @@
           <w:b w:val="0"/>
           <w:sz w:val="22"/>
         </w:rPr>
-        <w:t>Table 3.16 — Relational Constraints and Cascade Actions</w:t>
+        <w:t>Table 3.5 — Data Dictionary for Material Entity</w:t>
       </w:r>
       <w:r>
         <w:tab/>
@@ -2242,7 +2242,7 @@
           <w:b w:val="0"/>
           <w:sz w:val="22"/>
         </w:rPr>
-        <w:t>16</w:t>
+        <w:t>17</w:t>
       </w:r>
     </w:p>
     <w:p>
@@ -2259,7 +2259,7 @@
           <w:b w:val="0"/>
           <w:sz w:val="22"/>
         </w:rPr>
-        <w:t>Table 3.17 — Database Indexing Strategy and Query Optimization Roles</w:t>
+        <w:t>Table 3.6 — Data Dictionary for Property Entity</w:t>
       </w:r>
       <w:r>
         <w:tab/>
@@ -2270,7 +2270,7 @@
           <w:b w:val="0"/>
           <w:sz w:val="22"/>
         </w:rPr>
-        <w:t>16</w:t>
+        <w:t>17</w:t>
       </w:r>
     </w:p>
     <w:p>
@@ -2287,7 +2287,7 @@
           <w:b w:val="0"/>
           <w:sz w:val="22"/>
         </w:rPr>
-        <w:t>Table 4.1 — Software Technology Stack and Architectural Roles</w:t>
+        <w:t>Table 3.7 — Data Dictionary for Material_Property Association Table</w:t>
       </w:r>
       <w:r>
         <w:tab/>
@@ -2298,7 +2298,7 @@
           <w:b w:val="0"/>
           <w:sz w:val="22"/>
         </w:rPr>
-        <w:t>18</w:t>
+        <w:t>17</w:t>
       </w:r>
     </w:p>
     <w:p>
@@ -2315,7 +2315,7 @@
           <w:b w:val="0"/>
           <w:sz w:val="22"/>
         </w:rPr>
-        <w:t>Table 4.2 — Software Module Responsibilities and Source Code Mapping</w:t>
+        <w:t>Table 3.16 — Relational Constraints and Cascade Actions</w:t>
       </w:r>
       <w:r>
         <w:tab/>
@@ -2343,7 +2343,7 @@
           <w:b w:val="0"/>
           <w:sz w:val="22"/>
         </w:rPr>
-        <w:t>Table 4.3 — Ingested Catalog Data Sources and Ingestion Metrics</w:t>
+        <w:t>Table 3.17 — Database Indexing Strategy and Query Optimization Roles</w:t>
       </w:r>
       <w:r>
         <w:tab/>
@@ -2354,7 +2354,7 @@
           <w:b w:val="0"/>
           <w:sz w:val="22"/>
         </w:rPr>
-        <w:t>19</w:t>
+        <w:t>18</w:t>
       </w:r>
     </w:p>
     <w:p>
@@ -2371,7 +2371,7 @@
           <w:b w:val="0"/>
           <w:sz w:val="22"/>
         </w:rPr>
-        <w:t>Table 4.4 — Starbase RESTful API Endpoint Specifications</w:t>
+        <w:t>Table 4.1 — Software Technology Stack and Architectural Roles</w:t>
       </w:r>
       <w:r>
         <w:tab/>
@@ -2382,7 +2382,7 @@
           <w:b w:val="0"/>
           <w:sz w:val="22"/>
         </w:rPr>
-        <w:t>21</w:t>
+        <w:t>19</w:t>
       </w:r>
     </w:p>
     <w:p>
@@ -2399,7 +2399,7 @@
           <w:b w:val="0"/>
           <w:sz w:val="22"/>
         </w:rPr>
-        <w:t>Table 4.7 — Measured Query Execution Benchmarks and EXPLAIN Plans</w:t>
+        <w:t>Table 4.2 — Software Module Responsibilities and Source Code Mapping</w:t>
       </w:r>
       <w:r>
         <w:tab/>
@@ -2410,7 +2410,7 @@
           <w:b w:val="0"/>
           <w:sz w:val="22"/>
         </w:rPr>
-        <w:t>20</w:t>
+        <w:t>19</w:t>
       </w:r>
     </w:p>
     <w:p>
@@ -2427,7 +2427,7 @@
           <w:b w:val="0"/>
           <w:sz w:val="22"/>
         </w:rPr>
-        <w:t>Table 5.1 — Automated Integration and Regression Test Suite Results</w:t>
+        <w:t>Table 4.3 — Ingested Catalog Data Sources and Ingestion Metrics</w:t>
       </w:r>
       <w:r>
         <w:tab/>
@@ -2438,7 +2438,7 @@
           <w:b w:val="0"/>
           <w:sz w:val="22"/>
         </w:rPr>
-        <w:t>23</w:t>
+        <w:t>20</w:t>
       </w:r>
     </w:p>
     <w:p>
@@ -2455,7 +2455,7 @@
           <w:b w:val="0"/>
           <w:sz w:val="22"/>
         </w:rPr>
-        <w:t>Table 5.2 — Deployment and Hosting Architecture Status Matrix</w:t>
+        <w:t>Table 4.4 — Starbase RESTful API Endpoint Specifications</w:t>
       </w:r>
       <w:r>
         <w:tab/>
@@ -2466,7 +2466,91 @@
           <w:b w:val="0"/>
           <w:sz w:val="22"/>
         </w:rPr>
-        <w:t>27</w:t>
+        <w:t>23</w:t>
+      </w:r>
+    </w:p>
+    <w:p>
+      <w:pPr>
+        <w:tabs>
+          <w:tab w:pos="8669" w:val="right" w:leader="dot"/>
+        </w:tabs>
+        <w:spacing w:before="40" w:after="40" w:line="276" w:lineRule="auto"/>
+        <w:ind w:left="0" w:firstLine="0"/>
+      </w:pPr>
+      <w:r>
+        <w:rPr>
+          <w:rFonts w:ascii="Times New Roman" w:hAnsi="Times New Roman"/>
+          <w:b w:val="0"/>
+          <w:sz w:val="22"/>
+        </w:rPr>
+        <w:t>Table 4.7 — Measured Query Execution Benchmarks and EXPLAIN Plans</w:t>
+      </w:r>
+      <w:r>
+        <w:tab/>
+      </w:r>
+      <w:r>
+        <w:rPr>
+          <w:rFonts w:ascii="Times New Roman" w:hAnsi="Times New Roman"/>
+          <w:b w:val="0"/>
+          <w:sz w:val="22"/>
+        </w:rPr>
+        <w:t>22</w:t>
+      </w:r>
+    </w:p>
+    <w:p>
+      <w:pPr>
+        <w:tabs>
+          <w:tab w:pos="8669" w:val="right" w:leader="dot"/>
+        </w:tabs>
+        <w:spacing w:before="40" w:after="40" w:line="276" w:lineRule="auto"/>
+        <w:ind w:left="0" w:firstLine="0"/>
+      </w:pPr>
+      <w:r>
+        <w:rPr>
+          <w:rFonts w:ascii="Times New Roman" w:hAnsi="Times New Roman"/>
+          <w:b w:val="0"/>
+          <w:sz w:val="22"/>
+        </w:rPr>
+        <w:t>Table 5.1 — Automated Integration and Regression Test Suite Results</w:t>
+      </w:r>
+      <w:r>
+        <w:tab/>
+      </w:r>
+      <w:r>
+        <w:rPr>
+          <w:rFonts w:ascii="Times New Roman" w:hAnsi="Times New Roman"/>
+          <w:b w:val="0"/>
+          <w:sz w:val="22"/>
+        </w:rPr>
+        <w:t>24</w:t>
+      </w:r>
+    </w:p>
+    <w:p>
+      <w:pPr>
+        <w:tabs>
+          <w:tab w:pos="8669" w:val="right" w:leader="dot"/>
+        </w:tabs>
+        <w:spacing w:before="40" w:after="40" w:line="276" w:lineRule="auto"/>
+        <w:ind w:left="0" w:firstLine="0"/>
+      </w:pPr>
+      <w:r>
+        <w:rPr>
+          <w:rFonts w:ascii="Times New Roman" w:hAnsi="Times New Roman"/>
+          <w:b w:val="0"/>
+          <w:sz w:val="22"/>
+        </w:rPr>
+        <w:t>Table 5.2 — Deployment and Hosting Architecture Status Matrix</w:t>
+      </w:r>
+      <w:r>
+        <w:tab/>
+      </w:r>
+      <w:r>
+        <w:rPr>
+          <w:rFonts w:ascii="Times New Roman" w:hAnsi="Times New Roman"/>
+          <w:b w:val="0"/>
+          <w:sz w:val="22"/>
+        </w:rPr>
+        <w:t>28</w:t>
       </w:r>
     </w:p>
     <w:p>
@@ -4126,6 +4210,77 @@
     </w:p>
     <w:p>
       <w:pPr>
+        <w:spacing w:before="0" w:after="80" w:line="324" w:lineRule="auto"/>
+        <w:jc w:val="both"/>
+      </w:pPr>
+      <w:r>
+        <w:rPr>
+          <w:rFonts w:ascii="Times New Roman" w:hAnsi="Times New Roman"/>
+          <w:b w:val="0"/>
+          <w:i w:val="0"/>
+          <w:sz w:val="24"/>
+        </w:rPr>
+        <w:t>Figure 2.2 illustrates the detailed multi-criteria screening, property validation, min-max normalization, and weighted priority ranking algorithm flowchart implemented across the SQL query engine and Node.js application tier.</w:t>
+      </w:r>
+    </w:p>
+    <w:p>
+      <w:pPr>
+        <w:keepNext/>
+        <w:spacing w:before="160" w:after="40"/>
+        <w:jc w:val="center"/>
+      </w:pPr>
+      <w:r>
+        <w:drawing>
+          <wp:inline xmlns:a="http://schemas.openxmlformats.org/drawingml/2006/main" xmlns:pic="http://schemas.openxmlformats.org/drawingml/2006/picture">
+            <wp:extent cx="5486400" cy="4937760"/>
+            <wp:docPr id="3" name="Picture 3"/>
+            <wp:cNvGraphicFramePr>
+              <a:graphicFrameLocks noChangeAspect="1"/>
+            </wp:cNvGraphicFramePr>
+            <a:graphic>
+              <a:graphicData uri="http://schemas.openxmlformats.org/drawingml/2006/picture">
+                <pic:pic>
+                  <pic:nvPicPr>
+                    <pic:cNvPr id="0" name="Fig2-4_Selection_Algorithm.png"/>
+                    <pic:cNvPicPr/>
+                  </pic:nvPicPr>
+                  <pic:blipFill>
+                    <a:blip r:embed="rId13"/>
+                    <a:stretch>
+                      <a:fillRect/>
+                    </a:stretch>
+                  </pic:blipFill>
+                  <pic:spPr>
+                    <a:xfrm>
+                      <a:off x="0" y="0"/>
+                      <a:ext cx="5486400" cy="4937760"/>
+                    </a:xfrm>
+                    <a:prstGeom prst="rect"/>
+                  </pic:spPr>
+                </pic:pic>
+              </a:graphicData>
+            </a:graphic>
+          </wp:inline>
+        </w:drawing>
+      </w:r>
+    </w:p>
+    <w:p>
+      <w:pPr>
+        <w:keepNext w:val="0"/>
+        <w:spacing w:before="40" w:after="200"/>
+        <w:jc w:val="center"/>
+      </w:pPr>
+      <w:r>
+        <w:rPr>
+          <w:rFonts w:ascii="Times New Roman" w:hAnsi="Times New Roman"/>
+          <w:b/>
+          <w:sz w:val="21"/>
+        </w:rPr>
+        <w:t>Figure 2.2 — Multi-criteria screening and weighted priority ranking algorithm flowchart.</w:t>
+      </w:r>
+    </w:p>
+    <w:p>
+      <w:pPr>
         <w:keepNext/>
         <w:spacing w:before="240" w:after="80"/>
         <w:jc w:val="left"/>
@@ -4151,7 +4306,7 @@
           <w:i w:val="0"/>
           <w:sz w:val="24"/>
         </w:rPr>
-        <w:t>The data interactions within Starbase are formalized through Level 0 and Level 1 Data Flow Diagrams (DFDs). Table 2.2 defines the functional processes and data store interactions.</w:t>
+        <w:t>The data interactions within Starbase are formalized through Level 0 and Level 1 Data Flow Diagrams (DFDs) shown in Figure 2.3 and Figure 2.4. Table 2.2 defines the functional processes and data store interactions.</w:t>
       </w:r>
     </w:p>
     <w:p>
@@ -4788,7 +4943,7 @@
         <w:drawing>
           <wp:inline xmlns:a="http://schemas.openxmlformats.org/drawingml/2006/main" xmlns:pic="http://schemas.openxmlformats.org/drawingml/2006/picture">
             <wp:extent cx="5303520" cy="2828544"/>
-            <wp:docPr id="3" name="Picture 3"/>
+            <wp:docPr id="4" name="Picture 4"/>
             <wp:cNvGraphicFramePr>
               <a:graphicFrameLocks noChangeAspect="1"/>
             </wp:cNvGraphicFramePr>
@@ -4800,7 +4955,7 @@
                     <pic:cNvPicPr/>
                   </pic:nvPicPr>
                   <pic:blipFill>
-                    <a:blip r:embed="rId13"/>
+                    <a:blip r:embed="rId14"/>
                     <a:stretch>
                       <a:fillRect/>
                     </a:stretch>
@@ -4831,7 +4986,7 @@
           <w:b/>
           <w:sz w:val="21"/>
         </w:rPr>
-        <w:t>Figure 2.2 — Level 0 Data Flow Diagram (Context Analysis).</w:t>
+        <w:t>Figure 2.3 — Level 0 Data Flow Diagram (Context Analysis).</w:t>
       </w:r>
     </w:p>
     <w:p>
@@ -4844,7 +4999,7 @@
         <w:drawing>
           <wp:inline xmlns:a="http://schemas.openxmlformats.org/drawingml/2006/main" xmlns:pic="http://schemas.openxmlformats.org/drawingml/2006/picture">
             <wp:extent cx="5029200" cy="5666232"/>
-            <wp:docPr id="4" name="Picture 4"/>
+            <wp:docPr id="5" name="Picture 5"/>
             <wp:cNvGraphicFramePr>
               <a:graphicFrameLocks noChangeAspect="1"/>
             </wp:cNvGraphicFramePr>
@@ -4856,7 +5011,7 @@
                     <pic:cNvPicPr/>
                   </pic:nvPicPr>
                   <pic:blipFill>
-                    <a:blip r:embed="rId14"/>
+                    <a:blip r:embed="rId15"/>
                     <a:stretch>
                       <a:fillRect/>
                     </a:stretch>
@@ -4887,7 +5042,7 @@
           <w:b/>
           <w:sz w:val="21"/>
         </w:rPr>
-        <w:t>Figure 2.3 — Level 1 Data Flow Diagram (Decomposed Functional Modules).</w:t>
+        <w:t>Figure 2.4 — Level 1 Data Flow Diagram (Decomposed Functional Modules).</w:t>
       </w:r>
     </w:p>
     <w:p>
@@ -5774,8 +5929,8 @@
       <w:r>
         <w:drawing>
           <wp:inline xmlns:a="http://schemas.openxmlformats.org/drawingml/2006/main" xmlns:pic="http://schemas.openxmlformats.org/drawingml/2006/picture">
-            <wp:extent cx="5303520" cy="6085449"/>
-            <wp:docPr id="5" name="Picture 5"/>
+            <wp:extent cx="5303520" cy="6132195"/>
+            <wp:docPr id="6" name="Picture 6"/>
             <wp:cNvGraphicFramePr>
               <a:graphicFrameLocks noChangeAspect="1"/>
             </wp:cNvGraphicFramePr>
@@ -5787,7 +5942,7 @@
                     <pic:cNvPicPr/>
                   </pic:nvPicPr>
                   <pic:blipFill>
-                    <a:blip r:embed="rId15"/>
+                    <a:blip r:embed="rId16"/>
                     <a:stretch>
                       <a:fillRect/>
                     </a:stretch>
@@ -5795,7 +5950,7 @@
                   <pic:spPr>
                     <a:xfrm>
                       <a:off x="0" y="0"/>
-                      <a:ext cx="5303520" cy="6085449"/>
+                      <a:ext cx="5303520" cy="6132195"/>
                     </a:xfrm>
                     <a:prstGeom prst="rect"/>
                   </pic:spPr>
@@ -6752,6 +6907,77 @@
           <w:sz w:val="24"/>
         </w:rPr>
         <w:t>(requirement_id, selection_id, property_id, min_value, max_value, target_value, weight, is_mandatory)</w:t>
+      </w:r>
+    </w:p>
+    <w:p>
+      <w:pPr>
+        <w:spacing w:before="0" w:after="80" w:line="324" w:lineRule="auto"/>
+        <w:jc w:val="both"/>
+      </w:pPr>
+      <w:r>
+        <w:rPr>
+          <w:rFonts w:ascii="Times New Roman" w:hAnsi="Times New Roman"/>
+          <w:b w:val="0"/>
+          <w:i w:val="0"/>
+          <w:sz w:val="24"/>
+        </w:rPr>
+        <w:t>Figure 3.2 illustrates the physical relational schema dependency and foreign key map across the active database tables, designating primary keys, foreign key constraints, cascade rules, and entity groupings.</w:t>
+      </w:r>
+    </w:p>
+    <w:p>
+      <w:pPr>
+        <w:keepNext/>
+        <w:spacing w:before="160" w:after="40"/>
+        <w:jc w:val="center"/>
+      </w:pPr>
+      <w:r>
+        <w:drawing>
+          <wp:inline xmlns:a="http://schemas.openxmlformats.org/drawingml/2006/main" xmlns:pic="http://schemas.openxmlformats.org/drawingml/2006/picture">
+            <wp:extent cx="5486400" cy="4629150"/>
+            <wp:docPr id="7" name="Picture 7"/>
+            <wp:cNvGraphicFramePr>
+              <a:graphicFrameLocks noChangeAspect="1"/>
+            </wp:cNvGraphicFramePr>
+            <a:graphic>
+              <a:graphicData uri="http://schemas.openxmlformats.org/drawingml/2006/picture">
+                <pic:pic>
+                  <pic:nvPicPr>
+                    <pic:cNvPr id="0" name="Fig3-2_Relational_Schema_Map.png"/>
+                    <pic:cNvPicPr/>
+                  </pic:nvPicPr>
+                  <pic:blipFill>
+                    <a:blip r:embed="rId17"/>
+                    <a:stretch>
+                      <a:fillRect/>
+                    </a:stretch>
+                  </pic:blipFill>
+                  <pic:spPr>
+                    <a:xfrm>
+                      <a:off x="0" y="0"/>
+                      <a:ext cx="5486400" cy="4629150"/>
+                    </a:xfrm>
+                    <a:prstGeom prst="rect"/>
+                  </pic:spPr>
+                </pic:pic>
+              </a:graphicData>
+            </a:graphic>
+          </wp:inline>
+        </w:drawing>
+      </w:r>
+    </w:p>
+    <w:p>
+      <w:pPr>
+        <w:keepNext w:val="0"/>
+        <w:spacing w:before="40" w:after="200"/>
+        <w:jc w:val="center"/>
+      </w:pPr>
+      <w:r>
+        <w:rPr>
+          <w:rFonts w:ascii="Times New Roman" w:hAnsi="Times New Roman"/>
+          <w:b/>
+          <w:sz w:val="21"/>
+        </w:rPr>
+        <w:t>Figure 3.2 — Relational schema dependency and foreign key map across the core database tables.</w:t>
       </w:r>
     </w:p>
     <w:p>
@@ -12603,6 +12829,77 @@
           <w:sz w:val="24"/>
         </w:rPr>
         <w:t>Bulk loading millions of records requires strict transaction boundaries to prevent catalog corruption. In import-catalog.js, records are processed in bounded batches of 1,000 to 5,000 items. Each batch begins with START TRANSACTION, executes batch INSERT ... ON DUPLICATE KEY UPDATE queries into Material and Material_Property, and concludes with COMMIT. If a process failure or network disconnect occurs, the uncommitted batch rolls back cleanly without leaving orphaned material properties. The checkpoint offset is recorded in Catalog_Import_Progress, enabling idempotent replay upon restart.</w:t>
+      </w:r>
+    </w:p>
+    <w:p>
+      <w:pPr>
+        <w:spacing w:before="0" w:after="80" w:line="324" w:lineRule="auto"/>
+        <w:jc w:val="both"/>
+      </w:pPr>
+      <w:r>
+        <w:rPr>
+          <w:rFonts w:ascii="Times New Roman" w:hAnsi="Times New Roman"/>
+          <w:b w:val="0"/>
+          <w:i w:val="0"/>
+          <w:sz w:val="24"/>
+        </w:rPr>
+        <w:t>Figure 4.1 illustrates the transactional batch ETL pipeline and ingestion architecture, showing raw dataset extraction across 14 external repositories, SHA-256 integrity verification, reversible metadata codec packing, and ACID transaction boundaries.</w:t>
+      </w:r>
+    </w:p>
+    <w:p>
+      <w:pPr>
+        <w:keepNext/>
+        <w:spacing w:before="160" w:after="40"/>
+        <w:jc w:val="center"/>
+      </w:pPr>
+      <w:r>
+        <w:drawing>
+          <wp:inline xmlns:a="http://schemas.openxmlformats.org/drawingml/2006/main" xmlns:pic="http://schemas.openxmlformats.org/drawingml/2006/picture">
+            <wp:extent cx="5486400" cy="4023360"/>
+            <wp:docPr id="8" name="Picture 8"/>
+            <wp:cNvGraphicFramePr>
+              <a:graphicFrameLocks noChangeAspect="1"/>
+            </wp:cNvGraphicFramePr>
+            <a:graphic>
+              <a:graphicData uri="http://schemas.openxmlformats.org/drawingml/2006/picture">
+                <pic:pic>
+                  <pic:nvPicPr>
+                    <pic:cNvPr id="0" name="Fig4-1_ETL_Pipeline.png"/>
+                    <pic:cNvPicPr/>
+                  </pic:nvPicPr>
+                  <pic:blipFill>
+                    <a:blip r:embed="rId18"/>
+                    <a:stretch>
+                      <a:fillRect/>
+                    </a:stretch>
+                  </pic:blipFill>
+                  <pic:spPr>
+                    <a:xfrm>
+                      <a:off x="0" y="0"/>
+                      <a:ext cx="5486400" cy="4023360"/>
+                    </a:xfrm>
+                    <a:prstGeom prst="rect"/>
+                  </pic:spPr>
+                </pic:pic>
+              </a:graphicData>
+            </a:graphic>
+          </wp:inline>
+        </w:drawing>
+      </w:r>
+    </w:p>
+    <w:p>
+      <w:pPr>
+        <w:keepNext w:val="0"/>
+        <w:spacing w:before="40" w:after="200"/>
+        <w:jc w:val="center"/>
+      </w:pPr>
+      <w:r>
+        <w:rPr>
+          <w:rFonts w:ascii="Times New Roman" w:hAnsi="Times New Roman"/>
+          <w:b/>
+          <w:sz w:val="21"/>
+        </w:rPr>
+        <w:t>Figure 4.1 — Transactional batch ETL pipeline and ingestion architecture across 14 material repositories.</w:t>
       </w:r>
     </w:p>
     <w:p>
@@ -14824,7 +15121,7 @@
         <w:drawing>
           <wp:inline xmlns:a="http://schemas.openxmlformats.org/drawingml/2006/main" xmlns:pic="http://schemas.openxmlformats.org/drawingml/2006/picture">
             <wp:extent cx="5303520" cy="2983230"/>
-            <wp:docPr id="6" name="Picture 6"/>
+            <wp:docPr id="9" name="Picture 9"/>
             <wp:cNvGraphicFramePr>
               <a:graphicFrameLocks noChangeAspect="1"/>
             </wp:cNvGraphicFramePr>
@@ -14836,7 +15133,7 @@
                     <pic:cNvPicPr/>
                   </pic:nvPicPr>
                   <pic:blipFill>
-                    <a:blip r:embed="rId16"/>
+                    <a:blip r:embed="rId19"/>
                     <a:stretch>
                       <a:fillRect/>
                     </a:stretch>
@@ -14880,7 +15177,7 @@
         <w:drawing>
           <wp:inline xmlns:a="http://schemas.openxmlformats.org/drawingml/2006/main" xmlns:pic="http://schemas.openxmlformats.org/drawingml/2006/picture">
             <wp:extent cx="2926080" cy="6332337"/>
-            <wp:docPr id="7" name="Picture 7"/>
+            <wp:docPr id="10" name="Picture 10"/>
             <wp:cNvGraphicFramePr>
               <a:graphicFrameLocks noChangeAspect="1"/>
             </wp:cNvGraphicFramePr>
@@ -14892,7 +15189,7 @@
                     <pic:cNvPicPr/>
                   </pic:nvPicPr>
                   <pic:blipFill>
-                    <a:blip r:embed="rId17"/>
+                    <a:blip r:embed="rId20"/>
                     <a:stretch>
                       <a:fillRect/>
                     </a:stretch>
@@ -14936,7 +15233,7 @@
         <w:drawing>
           <wp:inline xmlns:a="http://schemas.openxmlformats.org/drawingml/2006/main" xmlns:pic="http://schemas.openxmlformats.org/drawingml/2006/picture">
             <wp:extent cx="5303520" cy="2983230"/>
-            <wp:docPr id="8" name="Picture 8"/>
+            <wp:docPr id="11" name="Picture 11"/>
             <wp:cNvGraphicFramePr>
               <a:graphicFrameLocks noChangeAspect="1"/>
             </wp:cNvGraphicFramePr>
@@ -14948,7 +15245,7 @@
                     <pic:cNvPicPr/>
                   </pic:nvPicPr>
                   <pic:blipFill>
-                    <a:blip r:embed="rId18"/>
+                    <a:blip r:embed="rId21"/>
                     <a:stretch>
                       <a:fillRect/>
                     </a:stretch>
@@ -14992,7 +15289,7 @@
         <w:drawing>
           <wp:inline xmlns:a="http://schemas.openxmlformats.org/drawingml/2006/main" xmlns:pic="http://schemas.openxmlformats.org/drawingml/2006/picture">
             <wp:extent cx="5303520" cy="3646170"/>
-            <wp:docPr id="9" name="Picture 9"/>
+            <wp:docPr id="12" name="Picture 12"/>
             <wp:cNvGraphicFramePr>
               <a:graphicFrameLocks noChangeAspect="1"/>
             </wp:cNvGraphicFramePr>
@@ -15004,7 +15301,7 @@
                     <pic:cNvPicPr/>
                   </pic:nvPicPr>
                   <pic:blipFill>
-                    <a:blip r:embed="rId19"/>
+                    <a:blip r:embed="rId22"/>
                     <a:stretch>
                       <a:fillRect/>
                     </a:stretch>

</xml_diff>

<commit_message>
style: balance cover page vertical layout and typography
- Expand vertical paragraph spacing across all cover blocks to span the full page height (from 7.6% down to 91.5% coverage)
- Scale CET crest width to 1.6 inches and balance line heights (20pt line spacing for members and affiliation blocks)
- Ground 'Academic Year 2026–2027' at y=71.0pt, eliminating bottom empty whitespace
- Recompile final DOCX and 40-page PDF with synchronized folios
</commit_message>
<xml_diff>
--- a/Starbase Material Selection System — Project Report.docx
+++ b/Starbase Material Selection System — Project Report.docx
@@ -4,13 +4,13 @@
   <w:body>
     <w:p>
       <w:pPr>
-        <w:spacing w:before="0" w:after="240"/>
+        <w:spacing w:before="0" w:after="400"/>
         <w:jc w:val="center"/>
       </w:pPr>
       <w:r>
         <w:drawing>
           <wp:inline xmlns:a="http://schemas.openxmlformats.org/drawingml/2006/main" xmlns:pic="http://schemas.openxmlformats.org/drawingml/2006/picture">
-            <wp:extent cx="1051560" cy="1172489"/>
+            <wp:extent cx="1463040" cy="1631290"/>
             <wp:docPr id="1" name="Picture 1"/>
             <wp:cNvGraphicFramePr>
               <a:graphicFrameLocks noChangeAspect="1"/>
@@ -31,7 +31,7 @@
                   <pic:spPr>
                     <a:xfrm>
                       <a:off x="0" y="0"/>
-                      <a:ext cx="1051560" cy="1172489"/>
+                      <a:ext cx="1463040" cy="1631290"/>
                     </a:xfrm>
                     <a:prstGeom prst="rect"/>
                   </pic:spPr>
@@ -44,7 +44,7 @@
     </w:p>
     <w:p>
       <w:pPr>
-        <w:spacing w:before="0" w:after="200" w:line="276" w:lineRule="auto"/>
+        <w:spacing w:before="0" w:after="320" w:line="520" w:lineRule="exact"/>
         <w:jc w:val="center"/>
       </w:pPr>
       <w:r>
@@ -52,14 +52,16 @@
           <w:rFonts w:ascii="Times New Roman" w:hAnsi="Times New Roman"/>
           <w:b/>
           <w:i/>
-          <w:sz w:val="48"/>
-        </w:rPr>
-        <w:t>STARBASE MATERIAL SELECTION SYSTEM</w:t>
+          <w:sz w:val="44"/>
+        </w:rPr>
+        <w:t>STARBASE MATERIAL SELECTION</w:t>
+        <w:br/>
+        <w:t>SYSTEM</w:t>
       </w:r>
     </w:p>
     <w:p>
       <w:pPr>
-        <w:spacing w:before="0" w:after="240"/>
+        <w:spacing w:before="0" w:after="320"/>
         <w:jc w:val="center"/>
       </w:pPr>
       <w:r>
@@ -73,7 +75,7 @@
     </w:p>
     <w:p>
       <w:pPr>
-        <w:spacing w:before="0" w:after="200"/>
+        <w:spacing w:before="0" w:after="320"/>
         <w:jc w:val="center"/>
       </w:pPr>
       <w:r>
@@ -87,7 +89,7 @@
     </w:p>
     <w:p>
       <w:pPr>
-        <w:spacing w:before="0" w:after="160" w:line="276" w:lineRule="auto"/>
+        <w:spacing w:before="0" w:after="440" w:line="400" w:lineRule="exact"/>
         <w:jc w:val="center"/>
       </w:pPr>
       <w:r>
@@ -119,7 +121,7 @@
     </w:p>
     <w:p>
       <w:pPr>
-        <w:spacing w:before="0" w:after="160" w:line="276" w:lineRule="auto"/>
+        <w:spacing w:before="0" w:after="440" w:line="400" w:lineRule="exact"/>
         <w:jc w:val="center"/>
       </w:pPr>
       <w:r>
@@ -151,7 +153,7 @@
     </w:p>
     <w:p>
       <w:pPr>
-        <w:spacing w:before="0" w:after="160" w:line="276" w:lineRule="auto"/>
+        <w:spacing w:before="0" w:after="440" w:line="400" w:lineRule="exact"/>
         <w:jc w:val="center"/>
       </w:pPr>
       <w:r>
@@ -183,7 +185,7 @@
     </w:p>
     <w:p>
       <w:pPr>
-        <w:spacing w:before="0" w:after="160" w:line="276" w:lineRule="auto"/>
+        <w:spacing w:before="0" w:after="440" w:line="400" w:lineRule="exact"/>
         <w:jc w:val="center"/>
       </w:pPr>
       <w:r>
@@ -215,7 +217,7 @@
     </w:p>
     <w:p>
       <w:pPr>
-        <w:spacing w:before="200" w:after="240" w:line="276" w:lineRule="auto"/>
+        <w:spacing w:before="560" w:after="560" w:line="400" w:lineRule="exact"/>
         <w:jc w:val="center"/>
       </w:pPr>
       <w:r>
@@ -263,7 +265,7 @@
       <w:pPr>
         <w:sectPr>
           <w:pgSz w:w="11905" w:h="16838"/>
-          <w:pgMar w:top="1440" w:right="1440" w:bottom="1440" w:left="1800" w:header="720" w:footer="720" w:gutter="0"/>
+          <w:pgMar w:top="1008" w:right="1440" w:bottom="1008" w:left="1440" w:header="720" w:footer="720" w:gutter="0"/>
           <w:cols w:space="720"/>
           <w:docGrid w:linePitch="360"/>
         </w:sectPr>

</xml_diff>